<commit_message>
add:docker step for todo-service
</commit_message>
<xml_diff>
--- a/setup guide.docx
+++ b/setup guide.docx
@@ -114,15 +114,7 @@
     </w:p>
     <w:p>
       <w:r>
-        <w:t xml:space="preserve">Git </w:t>
-      </w:r>
-      <w:proofErr w:type="gramStart"/>
-      <w:r>
-        <w:t>add</w:t>
-      </w:r>
-      <w:proofErr w:type="gramEnd"/>
-      <w:r>
-        <w:t xml:space="preserve">  .</w:t>
+        <w:t>Git add  .</w:t>
       </w:r>
     </w:p>
     <w:p>
@@ -510,34 +502,81 @@
         <w:t>:-</w:t>
       </w:r>
       <w:r>
+        <w:t xml:space="preserve"> http://</w:t>
+      </w:r>
+      <w:r>
+        <w:t>&lt;sonar-server-public-ip&gt;</w:t>
+      </w:r>
+      <w:r>
+        <w:t>:9000</w:t>
+      </w:r>
+    </w:p>
+    <w:p>
+      <w:r>
+        <w:t>3)</w:t>
+      </w:r>
+      <w:r>
         <w:t xml:space="preserve"> </w:t>
       </w:r>
       <w:r>
-        <w:t>http://</w:t>
-      </w:r>
-      <w:r>
-        <w:t>&lt;sonar-server-public-ip&gt;</w:t>
-      </w:r>
-      <w:r>
-        <w:t>:9000</w:t>
-      </w:r>
-    </w:p>
-    <w:p/>
-    <w:p/>
-    <w:p/>
-    <w:p/>
-    <w:p/>
-    <w:p/>
-    <w:p/>
-    <w:p/>
-    <w:p/>
-    <w:p/>
-    <w:p/>
-    <w:p/>
-    <w:p/>
-    <w:p/>
-    <w:p>
-      <w:r>
+        <w:t>DOCKERHUB_USERNAME</w:t>
+      </w:r>
+      <w:r>
+        <w:t xml:space="preserve">=&lt;your-user-name&gt; ====add it in </w:t>
+      </w:r>
+      <w:proofErr w:type="spellStart"/>
+      <w:r>
+        <w:t>github</w:t>
+      </w:r>
+      <w:proofErr w:type="spellEnd"/>
+      <w:r>
+        <w:t xml:space="preserve"> action variable</w:t>
+      </w:r>
+    </w:p>
+    <w:p>
+      <w:r>
+        <w:t>4)</w:t>
+      </w:r>
+      <w:r>
+        <w:rPr>
+          <w:rFonts w:ascii="Courier New" w:hAnsi="Courier New" w:cs="Courier New"/>
+          <w:sz w:val="20"/>
+          <w:szCs w:val="20"/>
+        </w:rPr>
+        <w:t xml:space="preserve"> </w:t>
+      </w:r>
+      <w:r>
+        <w:t>DOCKERHUB_TOKEN</w:t>
+      </w:r>
+      <w:r>
+        <w:t xml:space="preserve">=&lt;your-docker-hub-password OR add-docker hub token&gt;add the password in </w:t>
+      </w:r>
+      <w:proofErr w:type="spellStart"/>
+      <w:r>
+        <w:t>github</w:t>
+      </w:r>
+      <w:proofErr w:type="spellEnd"/>
+      <w:r>
+        <w:t xml:space="preserve"> Action secret </w:t>
+      </w:r>
+    </w:p>
+    <w:p/>
+    <w:p/>
+    <w:p/>
+    <w:p/>
+    <w:p/>
+    <w:p/>
+    <w:p/>
+    <w:p/>
+    <w:p/>
+    <w:p/>
+    <w:p/>
+    <w:p/>
+    <w:p/>
+    <w:p/>
+    <w:p>
+      <w:r>
+        <w:lastRenderedPageBreak/>
         <w:t>Sample</w:t>
       </w:r>
     </w:p>
@@ -692,6 +731,7 @@
     </w:p>
     <w:p>
       <w:r>
+        <w:lastRenderedPageBreak/>
         <w:t xml:space="preserve">          - client</w:t>
       </w:r>
     </w:p>
@@ -703,7 +743,6 @@
     </w:p>
     <w:p>
       <w:r>
-        <w:lastRenderedPageBreak/>
         <w:t xml:space="preserve">      - name: Checkout code</w:t>
       </w:r>
     </w:p>
@@ -878,7 +917,6 @@
     </w:p>
     <w:p>
       <w:r>
-        <w:lastRenderedPageBreak/>
         <w:t xml:space="preserve">        run: </w:t>
       </w:r>
       <w:proofErr w:type="spellStart"/>

</xml_diff>